<commit_message>
Fix table column widths in Word conversion - enforce fixed layout with full page width
</commit_message>
<xml_diff>
--- a/AI-Training-Activity.docx
+++ b/AI-Training-Activity.docx
@@ -17,7 +17,7 @@
         </w:r>
       </w:hyperlink>
     </w:p>
-    <w:bookmarkStart w:id="52" w:name="Xe314eba9f5ae1c528b1fd7e35d591addc1eb78f"/>
+    <w:bookmarkStart w:id="53" w:name="Xe314eba9f5ae1c528b1fd7e35d591addc1eb78f"/>
     <w:p>
       <w:pPr>
         <w:pStyle w:val="Heading1"/>
@@ -356,7 +356,7 @@
       </w:r>
     </w:p>
     <w:bookmarkEnd w:id="13"/>
-    <w:bookmarkStart w:id="44" w:name="jordan-lees-email-archive-30-emails"/>
+    <w:bookmarkStart w:id="52" w:name="jordan-lees-email-archive-30-emails"/>
     <w:p>
       <w:pPr>
         <w:pStyle w:val="Heading2"/>
@@ -365,6 +365,15 @@
         <w:t xml:space="preserve">Jordan Lee’s Email Archive (30 Emails)</w:t>
       </w:r>
     </w:p>
+    <w:p>
+      <w:pPr>
+        <w:pStyle w:val="FirstParagraph"/>
+      </w:pPr>
+      <w:r>
+        <w:t xml:space="preserve">Copy All 30 Emails to Clipboard</w:t>
+      </w:r>
+    </w:p>
+    <w:bookmarkStart w:id="51" w:name="email-archive"/>
     <w:p>
       <w:pPr>
         <w:pStyle w:val="BlockText"/>
@@ -3862,23 +3871,134 @@
       </w:r>
     </w:p>
     <w:bookmarkEnd w:id="43"/>
+    <w:bookmarkStart w:id="48" w:name="activity-instructions"/>
+    <w:p>
+      <w:pPr>
+        <w:pStyle w:val="Heading2"/>
+      </w:pPr>
+      <w:r>
+        <w:t xml:space="preserve">Activity Instructions</w:t>
+      </w:r>
+    </w:p>
+    <w:bookmarkStart w:id="44" w:name="part-1-email-analysis-15-minutes"/>
+    <w:p>
+      <w:pPr>
+        <w:pStyle w:val="Heading3"/>
+      </w:pPr>
+      <w:r>
+        <w:t xml:space="preserve">Part 1: Email Analysis (15 minutes)</w:t>
+      </w:r>
+    </w:p>
+    <w:p>
+      <w:pPr>
+        <w:pStyle w:val="FirstParagraph"/>
+      </w:pPr>
+      <w:r>
+        <w:rPr>
+          <w:b/>
+          <w:bCs/>
+        </w:rPr>
+        <w:t xml:space="preserve">Task:</w:t>
+      </w:r>
+      <w:r>
+        <w:t xml:space="preserve"> </w:t>
+      </w:r>
+      <w:r>
+        <w:t xml:space="preserve">Read through all 30 emails carefully. As a team, use AI to analyze the email set.</w:t>
+      </w:r>
+    </w:p>
+    <w:p>
+      <w:pPr>
+        <w:pStyle w:val="BodyText"/>
+      </w:pPr>
+      <w:r>
+        <w:rPr>
+          <w:b/>
+          <w:bCs/>
+        </w:rPr>
+        <w:t xml:space="preserve">Steps:</w:t>
+      </w:r>
+      <w:r>
+        <w:t xml:space="preserve"> </w:t>
+      </w:r>
+      <w:r>
+        <w:t xml:space="preserve">1. Copy and paste all 30 emails into your AI tool</w:t>
+      </w:r>
+      <w:r>
+        <w:t xml:space="preserve"> </w:t>
+      </w:r>
+      <w:r>
+        <w:t xml:space="preserve">2. Write a prompt asking the AI to identify patterns in the emails. Consider asking the AI to analyze:</w:t>
+      </w:r>
+      <w:r>
+        <w:t xml:space="preserve"> </w:t>
+      </w:r>
+      <w:r>
+        <w:t xml:space="preserve">- What are the core job responsibilities this person performs?</w:t>
+      </w:r>
+      <w:r>
+        <w:t xml:space="preserve"> </w:t>
+      </w:r>
+      <w:r>
+        <w:t xml:space="preserve">- Who does this person interact with, and what is the nature of each relationship?</w:t>
+      </w:r>
+      <w:r>
+        <w:t xml:space="preserve"> </w:t>
+      </w:r>
+      <w:r>
+        <w:t xml:space="preserve">- What recurring tasks or processes does this person manage?</w:t>
+      </w:r>
+      <w:r>
+        <w:t xml:space="preserve"> </w:t>
+      </w:r>
+      <w:r>
+        <w:t xml:space="preserve">- What knowledge or skills does this person demonstrate?</w:t>
+      </w:r>
+      <w:r>
+        <w:t xml:space="preserve"> </w:t>
+      </w:r>
+      <w:r>
+        <w:t xml:space="preserve">- What decisions does this person make independently versus escalate?</w:t>
+      </w:r>
+      <w:r>
+        <w:t xml:space="preserve"> </w:t>
+      </w:r>
+      <w:r>
+        <w:t xml:space="preserve">- What tools, templates, or systems does this person use or reference?</w:t>
+      </w:r>
+      <w:r>
+        <w:t xml:space="preserve"> </w:t>
+      </w:r>
+      <w:r>
+        <w:t xml:space="preserve">3. Review the AI output critically. Does it capture everything? Did it miss any patterns? Are any conclusions inaccurate?</w:t>
+      </w:r>
+    </w:p>
+    <w:p>
+      <w:pPr>
+        <w:pStyle w:val="BodyText"/>
+      </w:pPr>
+      <w:r>
+        <w:rPr>
+          <w:b/>
+          <w:bCs/>
+        </w:rPr>
+        <w:t xml:space="preserve">Deliverable:</w:t>
+      </w:r>
+      <w:r>
+        <w:t xml:space="preserve"> </w:t>
+      </w:r>
+      <w:r>
+        <w:t xml:space="preserve">A team-reviewed list of key responsibilities, relationships, and competencies extracted from the emails.</w:t>
+      </w:r>
+    </w:p>
     <w:bookmarkEnd w:id="44"/>
-    <w:bookmarkStart w:id="49" w:name="activity-instructions"/>
-    <w:p>
-      <w:pPr>
-        <w:pStyle w:val="Heading2"/>
-      </w:pPr>
-      <w:r>
-        <w:t xml:space="preserve">Activity Instructions</w:t>
-      </w:r>
-    </w:p>
-    <w:bookmarkStart w:id="45" w:name="part-1-email-analysis-15-minutes"/>
+    <w:bookmarkStart w:id="45" w:name="X93de671617403d80b988f66a9870a5158837463"/>
     <w:p>
       <w:pPr>
         <w:pStyle w:val="Heading3"/>
       </w:pPr>
       <w:r>
-        <w:t xml:space="preserve">Part 1: Email Analysis (15 minutes)</w:t>
+        <w:t xml:space="preserve">Part 2: Relationship Network Map (15 minutes)</w:t>
       </w:r>
     </w:p>
     <w:p>
@@ -3896,7 +4016,7 @@
         <w:t xml:space="preserve"> </w:t>
       </w:r>
       <w:r>
-        <w:t xml:space="preserve">Read through all 30 emails carefully. As a team, use AI to analyze the email set.</w:t>
+        <w:t xml:space="preserve">Use AI to map Jordan’s professional network and visualize who this role connects to across the organization.</w:t>
       </w:r>
     </w:p>
     <w:p>
@@ -3914,55 +4034,203 @@
         <w:t xml:space="preserve"> </w:t>
       </w:r>
       <w:r>
-        <w:t xml:space="preserve">1. Copy and paste all 30 emails into your AI tool</w:t>
-      </w:r>
-      <w:r>
-        <w:t xml:space="preserve"> </w:t>
-      </w:r>
-      <w:r>
-        <w:t xml:space="preserve">2. Write a prompt asking the AI to identify patterns in the emails. Consider asking the AI to analyze:</w:t>
-      </w:r>
-      <w:r>
-        <w:t xml:space="preserve"> </w:t>
-      </w:r>
-      <w:r>
-        <w:t xml:space="preserve">- What are the core job responsibilities this person performs?</w:t>
-      </w:r>
-      <w:r>
-        <w:t xml:space="preserve"> </w:t>
-      </w:r>
-      <w:r>
-        <w:t xml:space="preserve">- Who does this person interact with, and what is the nature of each relationship?</w:t>
-      </w:r>
-      <w:r>
-        <w:t xml:space="preserve"> </w:t>
-      </w:r>
-      <w:r>
-        <w:t xml:space="preserve">- What recurring tasks or processes does this person manage?</w:t>
-      </w:r>
-      <w:r>
-        <w:t xml:space="preserve"> </w:t>
-      </w:r>
-      <w:r>
-        <w:t xml:space="preserve">- What knowledge or skills does this person demonstrate?</w:t>
-      </w:r>
-      <w:r>
-        <w:t xml:space="preserve"> </w:t>
-      </w:r>
-      <w:r>
-        <w:t xml:space="preserve">- What decisions does this person make independently versus escalate?</w:t>
-      </w:r>
-      <w:r>
-        <w:t xml:space="preserve"> </w:t>
-      </w:r>
-      <w:r>
-        <w:t xml:space="preserve">- What tools, templates, or systems does this person use or reference?</w:t>
-      </w:r>
-      <w:r>
-        <w:t xml:space="preserve"> </w:t>
-      </w:r>
-      <w:r>
-        <w:t xml:space="preserve">3. Review the AI output critically. Does it capture everything? Did it miss any patterns? Are any conclusions inaccurate?</w:t>
+        <w:t xml:space="preserve">1. Prompt the AI to analyze the 30 emails and create a relationship map. Your prompt should ask the AI to identify:</w:t>
+      </w:r>
+      <w:r>
+        <w:t xml:space="preserve"> </w:t>
+      </w:r>
+      <w:r>
+        <w:t xml:space="preserve">- Every person Jordan communicated with</w:t>
+      </w:r>
+      <w:r>
+        <w:t xml:space="preserve"> </w:t>
+      </w:r>
+      <w:r>
+        <w:t xml:space="preserve">- The direction of communication (who initiated?)</w:t>
+      </w:r>
+      <w:r>
+        <w:t xml:space="preserve"> </w:t>
+      </w:r>
+      <w:r>
+        <w:t xml:space="preserve">- The nature of each relationship (reporting, advisory, service, vendor, cross-functional peer)</w:t>
+      </w:r>
+      <w:r>
+        <w:t xml:space="preserve"> </w:t>
+      </w:r>
+      <w:r>
+        <w:t xml:space="preserve">- Frequency of contact (one-time vs. recurring)</w:t>
+      </w:r>
+      <w:r>
+        <w:t xml:space="preserve"> </w:t>
+      </w:r>
+      <w:r>
+        <w:t xml:space="preserve">- The type of interaction (information sharing, decision-making, problem-solving, coordination, escalation)</w:t>
+      </w:r>
+      <w:r>
+        <w:t xml:space="preserve"> </w:t>
+      </w:r>
+      <w:r>
+        <w:t xml:space="preserve">2. Ask the AI to categorize each contact into one of these relationship types:</w:t>
+      </w:r>
+      <w:r>
+        <w:t xml:space="preserve"> </w:t>
+      </w:r>
+      <w:r>
+        <w:t xml:space="preserve">-</w:t>
+      </w:r>
+      <w:r>
+        <w:t xml:space="preserve"> </w:t>
+      </w:r>
+      <w:r>
+        <w:rPr>
+          <w:b/>
+          <w:bCs/>
+        </w:rPr>
+        <w:t xml:space="preserve">Upward</w:t>
+      </w:r>
+      <w:r>
+        <w:t xml:space="preserve"> </w:t>
+      </w:r>
+      <w:r>
+        <w:t xml:space="preserve">(people Jordan reports to or needs approval from)</w:t>
+      </w:r>
+      <w:r>
+        <w:t xml:space="preserve"> </w:t>
+      </w:r>
+      <w:r>
+        <w:t xml:space="preserve">-</w:t>
+      </w:r>
+      <w:r>
+        <w:t xml:space="preserve"> </w:t>
+      </w:r>
+      <w:r>
+        <w:rPr>
+          <w:b/>
+          <w:bCs/>
+        </w:rPr>
+        <w:t xml:space="preserve">Lateral</w:t>
+      </w:r>
+      <w:r>
+        <w:t xml:space="preserve"> </w:t>
+      </w:r>
+      <w:r>
+        <w:t xml:space="preserve">(peers and cross-functional partners)</w:t>
+      </w:r>
+      <w:r>
+        <w:t xml:space="preserve"> </w:t>
+      </w:r>
+      <w:r>
+        <w:t xml:space="preserve">-</w:t>
+      </w:r>
+      <w:r>
+        <w:t xml:space="preserve"> </w:t>
+      </w:r>
+      <w:r>
+        <w:rPr>
+          <w:b/>
+          <w:bCs/>
+        </w:rPr>
+        <w:t xml:space="preserve">Downward/Service</w:t>
+      </w:r>
+      <w:r>
+        <w:t xml:space="preserve"> </w:t>
+      </w:r>
+      <w:r>
+        <w:t xml:space="preserve">(employees Jordan supports or advises)</w:t>
+      </w:r>
+      <w:r>
+        <w:t xml:space="preserve"> </w:t>
+      </w:r>
+      <w:r>
+        <w:t xml:space="preserve">-</w:t>
+      </w:r>
+      <w:r>
+        <w:t xml:space="preserve"> </w:t>
+      </w:r>
+      <w:r>
+        <w:rPr>
+          <w:b/>
+          <w:bCs/>
+        </w:rPr>
+        <w:t xml:space="preserve">External</w:t>
+      </w:r>
+      <w:r>
+        <w:t xml:space="preserve"> </w:t>
+      </w:r>
+      <w:r>
+        <w:t xml:space="preserve">(vendors, recruiters, legal counsel)</w:t>
+      </w:r>
+      <w:r>
+        <w:t xml:space="preserve"> </w:t>
+      </w:r>
+      <w:r>
+        <w:t xml:space="preserve">3. Ask the AI to generate a visual network diagram using text-based format (e.g., ASCII art, Mermaid diagram syntax, or a structured table). The diagram should show:</w:t>
+      </w:r>
+      <w:r>
+        <w:t xml:space="preserve"> </w:t>
+      </w:r>
+      <w:r>
+        <w:t xml:space="preserve">- Jordan at the center</w:t>
+      </w:r>
+      <w:r>
+        <w:t xml:space="preserve"> </w:t>
+      </w:r>
+      <w:r>
+        <w:t xml:space="preserve">- Lines connecting to each contact, labeled with the relationship type</w:t>
+      </w:r>
+      <w:r>
+        <w:t xml:space="preserve"> </w:t>
+      </w:r>
+      <w:r>
+        <w:t xml:space="preserve">- Thicker or double lines for high-frequency contacts</w:t>
+      </w:r>
+      <w:r>
+        <w:t xml:space="preserve"> </w:t>
+      </w:r>
+      <w:r>
+        <w:t xml:space="preserve">- Clusters for related contacts (e.g., all vendor relationships grouped together)</w:t>
+      </w:r>
+      <w:r>
+        <w:t xml:space="preserve"> </w:t>
+      </w:r>
+      <w:r>
+        <w:t xml:space="preserve">4. As a team, evaluate the AI-generated network map:</w:t>
+      </w:r>
+      <w:r>
+        <w:t xml:space="preserve"> </w:t>
+      </w:r>
+      <w:r>
+        <w:t xml:space="preserve">- Did the AI correctly identify all contacts?</w:t>
+      </w:r>
+      <w:r>
+        <w:t xml:space="preserve"> </w:t>
+      </w:r>
+      <w:r>
+        <w:t xml:space="preserve">- Are the relationship classifications accurate?</w:t>
+      </w:r>
+      <w:r>
+        <w:t xml:space="preserve"> </w:t>
+      </w:r>
+      <w:r>
+        <w:t xml:space="preserve">- Who would be the most critical contacts for a new hire to build relationships with first, and why?</w:t>
+      </w:r>
+      <w:r>
+        <w:t xml:space="preserve"> </w:t>
+      </w:r>
+      <w:r>
+        <w:t xml:space="preserve">- Are there any</w:t>
+      </w:r>
+      <w:r>
+        <w:t xml:space="preserve"> </w:t>
+      </w:r>
+      <w:r>
+        <w:t xml:space="preserve">“hidden”</w:t>
+      </w:r>
+      <w:r>
+        <w:t xml:space="preserve"> </w:t>
+      </w:r>
+      <w:r>
+        <w:t xml:space="preserve">connections the emails suggest but don’t explicitly show?</w:t>
       </w:r>
     </w:p>
     <w:p>
@@ -3980,271 +4248,11 @@
         <w:t xml:space="preserve"> </w:t>
       </w:r>
       <w:r>
-        <w:t xml:space="preserve">A team-reviewed list of key responsibilities, relationships, and competencies extracted from the emails.</w:t>
+        <w:t xml:space="preserve">A visual network map with a brief written analysis (half page) identifying the 5 most critical relationships for the role and explaining why they matter for onboarding.</w:t>
       </w:r>
     </w:p>
     <w:bookmarkEnd w:id="45"/>
-    <w:bookmarkStart w:id="46" w:name="X93de671617403d80b988f66a9870a5158837463"/>
-    <w:p>
-      <w:pPr>
-        <w:pStyle w:val="Heading3"/>
-      </w:pPr>
-      <w:r>
-        <w:t xml:space="preserve">Part 2: Relationship Network Map (15 minutes)</w:t>
-      </w:r>
-    </w:p>
-    <w:p>
-      <w:pPr>
-        <w:pStyle w:val="FirstParagraph"/>
-      </w:pPr>
-      <w:r>
-        <w:rPr>
-          <w:b/>
-          <w:bCs/>
-        </w:rPr>
-        <w:t xml:space="preserve">Task:</w:t>
-      </w:r>
-      <w:r>
-        <w:t xml:space="preserve"> </w:t>
-      </w:r>
-      <w:r>
-        <w:t xml:space="preserve">Use AI to map Jordan’s professional network and visualize who this role connects to across the organization.</w:t>
-      </w:r>
-    </w:p>
-    <w:p>
-      <w:pPr>
-        <w:pStyle w:val="BodyText"/>
-      </w:pPr>
-      <w:r>
-        <w:rPr>
-          <w:b/>
-          <w:bCs/>
-        </w:rPr>
-        <w:t xml:space="preserve">Steps:</w:t>
-      </w:r>
-      <w:r>
-        <w:t xml:space="preserve"> </w:t>
-      </w:r>
-      <w:r>
-        <w:t xml:space="preserve">1. Prompt the AI to analyze the 30 emails and create a relationship map. Your prompt should ask the AI to identify:</w:t>
-      </w:r>
-      <w:r>
-        <w:t xml:space="preserve"> </w:t>
-      </w:r>
-      <w:r>
-        <w:t xml:space="preserve">- Every person Jordan communicated with</w:t>
-      </w:r>
-      <w:r>
-        <w:t xml:space="preserve"> </w:t>
-      </w:r>
-      <w:r>
-        <w:t xml:space="preserve">- The direction of communication (who initiated?)</w:t>
-      </w:r>
-      <w:r>
-        <w:t xml:space="preserve"> </w:t>
-      </w:r>
-      <w:r>
-        <w:t xml:space="preserve">- The nature of each relationship (reporting, advisory, service, vendor, cross-functional peer)</w:t>
-      </w:r>
-      <w:r>
-        <w:t xml:space="preserve"> </w:t>
-      </w:r>
-      <w:r>
-        <w:t xml:space="preserve">- Frequency of contact (one-time vs. recurring)</w:t>
-      </w:r>
-      <w:r>
-        <w:t xml:space="preserve"> </w:t>
-      </w:r>
-      <w:r>
-        <w:t xml:space="preserve">- The type of interaction (information sharing, decision-making, problem-solving, coordination, escalation)</w:t>
-      </w:r>
-      <w:r>
-        <w:t xml:space="preserve"> </w:t>
-      </w:r>
-      <w:r>
-        <w:t xml:space="preserve">2. Ask the AI to categorize each contact into one of these relationship types:</w:t>
-      </w:r>
-      <w:r>
-        <w:t xml:space="preserve"> </w:t>
-      </w:r>
-      <w:r>
-        <w:t xml:space="preserve">-</w:t>
-      </w:r>
-      <w:r>
-        <w:t xml:space="preserve"> </w:t>
-      </w:r>
-      <w:r>
-        <w:rPr>
-          <w:b/>
-          <w:bCs/>
-        </w:rPr>
-        <w:t xml:space="preserve">Upward</w:t>
-      </w:r>
-      <w:r>
-        <w:t xml:space="preserve"> </w:t>
-      </w:r>
-      <w:r>
-        <w:t xml:space="preserve">(people Jordan reports to or needs approval from)</w:t>
-      </w:r>
-      <w:r>
-        <w:t xml:space="preserve"> </w:t>
-      </w:r>
-      <w:r>
-        <w:t xml:space="preserve">-</w:t>
-      </w:r>
-      <w:r>
-        <w:t xml:space="preserve"> </w:t>
-      </w:r>
-      <w:r>
-        <w:rPr>
-          <w:b/>
-          <w:bCs/>
-        </w:rPr>
-        <w:t xml:space="preserve">Lateral</w:t>
-      </w:r>
-      <w:r>
-        <w:t xml:space="preserve"> </w:t>
-      </w:r>
-      <w:r>
-        <w:t xml:space="preserve">(peers and cross-functional partners)</w:t>
-      </w:r>
-      <w:r>
-        <w:t xml:space="preserve"> </w:t>
-      </w:r>
-      <w:r>
-        <w:t xml:space="preserve">-</w:t>
-      </w:r>
-      <w:r>
-        <w:t xml:space="preserve"> </w:t>
-      </w:r>
-      <w:r>
-        <w:rPr>
-          <w:b/>
-          <w:bCs/>
-        </w:rPr>
-        <w:t xml:space="preserve">Downward/Service</w:t>
-      </w:r>
-      <w:r>
-        <w:t xml:space="preserve"> </w:t>
-      </w:r>
-      <w:r>
-        <w:t xml:space="preserve">(employees Jordan supports or advises)</w:t>
-      </w:r>
-      <w:r>
-        <w:t xml:space="preserve"> </w:t>
-      </w:r>
-      <w:r>
-        <w:t xml:space="preserve">-</w:t>
-      </w:r>
-      <w:r>
-        <w:t xml:space="preserve"> </w:t>
-      </w:r>
-      <w:r>
-        <w:rPr>
-          <w:b/>
-          <w:bCs/>
-        </w:rPr>
-        <w:t xml:space="preserve">External</w:t>
-      </w:r>
-      <w:r>
-        <w:t xml:space="preserve"> </w:t>
-      </w:r>
-      <w:r>
-        <w:t xml:space="preserve">(vendors, recruiters, legal counsel)</w:t>
-      </w:r>
-      <w:r>
-        <w:t xml:space="preserve"> </w:t>
-      </w:r>
-      <w:r>
-        <w:t xml:space="preserve">3. Ask the AI to generate a visual network diagram using text-based format (e.g., ASCII art, Mermaid diagram syntax, or a structured table). The diagram should show:</w:t>
-      </w:r>
-      <w:r>
-        <w:t xml:space="preserve"> </w:t>
-      </w:r>
-      <w:r>
-        <w:t xml:space="preserve">- Jordan at the center</w:t>
-      </w:r>
-      <w:r>
-        <w:t xml:space="preserve"> </w:t>
-      </w:r>
-      <w:r>
-        <w:t xml:space="preserve">- Lines connecting to each contact, labeled with the relationship type</w:t>
-      </w:r>
-      <w:r>
-        <w:t xml:space="preserve"> </w:t>
-      </w:r>
-      <w:r>
-        <w:t xml:space="preserve">- Thicker or double lines for high-frequency contacts</w:t>
-      </w:r>
-      <w:r>
-        <w:t xml:space="preserve"> </w:t>
-      </w:r>
-      <w:r>
-        <w:t xml:space="preserve">- Clusters for related contacts (e.g., all vendor relationships grouped together)</w:t>
-      </w:r>
-      <w:r>
-        <w:t xml:space="preserve"> </w:t>
-      </w:r>
-      <w:r>
-        <w:t xml:space="preserve">4. As a team, evaluate the AI-generated network map:</w:t>
-      </w:r>
-      <w:r>
-        <w:t xml:space="preserve"> </w:t>
-      </w:r>
-      <w:r>
-        <w:t xml:space="preserve">- Did the AI correctly identify all contacts?</w:t>
-      </w:r>
-      <w:r>
-        <w:t xml:space="preserve"> </w:t>
-      </w:r>
-      <w:r>
-        <w:t xml:space="preserve">- Are the relationship classifications accurate?</w:t>
-      </w:r>
-      <w:r>
-        <w:t xml:space="preserve"> </w:t>
-      </w:r>
-      <w:r>
-        <w:t xml:space="preserve">- Who would be the most critical contacts for a new hire to build relationships with first, and why?</w:t>
-      </w:r>
-      <w:r>
-        <w:t xml:space="preserve"> </w:t>
-      </w:r>
-      <w:r>
-        <w:t xml:space="preserve">- Are there any</w:t>
-      </w:r>
-      <w:r>
-        <w:t xml:space="preserve"> </w:t>
-      </w:r>
-      <w:r>
-        <w:t xml:space="preserve">“hidden”</w:t>
-      </w:r>
-      <w:r>
-        <w:t xml:space="preserve"> </w:t>
-      </w:r>
-      <w:r>
-        <w:t xml:space="preserve">connections the emails suggest but don’t explicitly show?</w:t>
-      </w:r>
-    </w:p>
-    <w:p>
-      <w:pPr>
-        <w:pStyle w:val="BodyText"/>
-      </w:pPr>
-      <w:r>
-        <w:rPr>
-          <w:b/>
-          <w:bCs/>
-        </w:rPr>
-        <w:t xml:space="preserve">Deliverable:</w:t>
-      </w:r>
-      <w:r>
-        <w:t xml:space="preserve"> </w:t>
-      </w:r>
-      <w:r>
-        <w:t xml:space="preserve">A visual network map with a brief written analysis (half page) identifying the 5 most critical relationships for the role and explaining why they matter for onboarding.</w:t>
-      </w:r>
-    </w:p>
-    <w:bookmarkEnd w:id="46"/>
-    <w:bookmarkStart w:id="47" w:name="X20655d0909604d8ee961c2af6780bfcb0d588cb"/>
+    <w:bookmarkStart w:id="46" w:name="X20655d0909604d8ee961c2af6780bfcb0d588cb"/>
     <w:p>
       <w:pPr>
         <w:pStyle w:val="Heading3"/>
@@ -4377,175 +4385,175 @@
         <w:t xml:space="preserve">A complete, polished job description (1-2 pages).</w:t>
       </w:r>
     </w:p>
+    <w:bookmarkEnd w:id="46"/>
+    <w:bookmarkStart w:id="47" w:name="Xa2cb412a1db5dd24c833bda52b067160148ad83"/>
+    <w:p>
+      <w:pPr>
+        <w:pStyle w:val="Heading3"/>
+      </w:pPr>
+      <w:r>
+        <w:t xml:space="preserve">Part 4: Onboarding Training Guide (20 minutes)</w:t>
+      </w:r>
+    </w:p>
+    <w:p>
+      <w:pPr>
+        <w:pStyle w:val="FirstParagraph"/>
+      </w:pPr>
+      <w:r>
+        <w:rPr>
+          <w:b/>
+          <w:bCs/>
+        </w:rPr>
+        <w:t xml:space="preserve">Task:</w:t>
+      </w:r>
+      <w:r>
+        <w:t xml:space="preserve"> </w:t>
+      </w:r>
+      <w:r>
+        <w:t xml:space="preserve">Transform your job description into a structured 2-week onboarding training plan for the new HR Coordinator.</w:t>
+      </w:r>
+    </w:p>
+    <w:p>
+      <w:pPr>
+        <w:pStyle w:val="BodyText"/>
+      </w:pPr>
+      <w:r>
+        <w:rPr>
+          <w:b/>
+          <w:bCs/>
+        </w:rPr>
+        <w:t xml:space="preserve">Steps:</w:t>
+      </w:r>
+      <w:r>
+        <w:t xml:space="preserve"> </w:t>
+      </w:r>
+      <w:r>
+        <w:t xml:space="preserve">1. Prompt the AI to convert the job description into a phased training plan:</w:t>
+      </w:r>
+      <w:r>
+        <w:t xml:space="preserve"> </w:t>
+      </w:r>
+      <w:r>
+        <w:t xml:space="preserve">-</w:t>
+      </w:r>
+      <w:r>
+        <w:t xml:space="preserve"> </w:t>
+      </w:r>
+      <w:r>
+        <w:rPr>
+          <w:b/>
+          <w:bCs/>
+        </w:rPr>
+        <w:t xml:space="preserve">Day 1-2:</w:t>
+      </w:r>
+      <w:r>
+        <w:t xml:space="preserve"> </w:t>
+      </w:r>
+      <w:r>
+        <w:t xml:space="preserve">Orientation, systems access, and introductions (what does the new hire need on day one?)</w:t>
+      </w:r>
+      <w:r>
+        <w:t xml:space="preserve"> </w:t>
+      </w:r>
+      <w:r>
+        <w:t xml:space="preserve">-</w:t>
+      </w:r>
+      <w:r>
+        <w:t xml:space="preserve"> </w:t>
+      </w:r>
+      <w:r>
+        <w:rPr>
+          <w:b/>
+          <w:bCs/>
+        </w:rPr>
+        <w:t xml:space="preserve">Day 3-5:</w:t>
+      </w:r>
+      <w:r>
+        <w:t xml:space="preserve"> </w:t>
+      </w:r>
+      <w:r>
+        <w:t xml:space="preserve">Core process training (which recurring tasks need to be mastered first?)</w:t>
+      </w:r>
+      <w:r>
+        <w:t xml:space="preserve"> </w:t>
+      </w:r>
+      <w:r>
+        <w:t xml:space="preserve">-</w:t>
+      </w:r>
+      <w:r>
+        <w:t xml:space="preserve"> </w:t>
+      </w:r>
+      <w:r>
+        <w:rPr>
+          <w:b/>
+          <w:bCs/>
+        </w:rPr>
+        <w:t xml:space="preserve">Week 2:</w:t>
+      </w:r>
+      <w:r>
+        <w:t xml:space="preserve"> </w:t>
+      </w:r>
+      <w:r>
+        <w:t xml:space="preserve">Guided practice with increasing independence (shadowing key processes, handling real tasks with supervision)</w:t>
+      </w:r>
+      <w:r>
+        <w:t xml:space="preserve"> </w:t>
+      </w:r>
+      <w:r>
+        <w:t xml:space="preserve">2. For each phase, include:</w:t>
+      </w:r>
+      <w:r>
+        <w:t xml:space="preserve"> </w:t>
+      </w:r>
+      <w:r>
+        <w:t xml:space="preserve">- Specific learning objectives</w:t>
+      </w:r>
+      <w:r>
+        <w:t xml:space="preserve"> </w:t>
+      </w:r>
+      <w:r>
+        <w:t xml:space="preserve">- Training methods (job shadowing, e-learning, hands-on practice, mentoring)</w:t>
+      </w:r>
+      <w:r>
+        <w:t xml:space="preserve"> </w:t>
+      </w:r>
+      <w:r>
+        <w:t xml:space="preserve">- Key people the new hire should meet and learn from</w:t>
+      </w:r>
+      <w:r>
+        <w:t xml:space="preserve"> </w:t>
+      </w:r>
+      <w:r>
+        <w:t xml:space="preserve">- Success metrics (how do we know the training worked?)</w:t>
+      </w:r>
+      <w:r>
+        <w:t xml:space="preserve"> </w:t>
+      </w:r>
+      <w:r>
+        <w:t xml:space="preserve">3. Identify at least 3 things the AI-generated training plan got wrong or missed, and correct them</w:t>
+      </w:r>
+    </w:p>
+    <w:p>
+      <w:pPr>
+        <w:pStyle w:val="BodyText"/>
+      </w:pPr>
+      <w:r>
+        <w:rPr>
+          <w:b/>
+          <w:bCs/>
+        </w:rPr>
+        <w:t xml:space="preserve">Deliverable:</w:t>
+      </w:r>
+      <w:r>
+        <w:t xml:space="preserve"> </w:t>
+      </w:r>
+      <w:r>
+        <w:t xml:space="preserve">A 2-week onboarding training guide (1-2 pages).</w:t>
+      </w:r>
+    </w:p>
     <w:bookmarkEnd w:id="47"/>
-    <w:bookmarkStart w:id="48" w:name="Xa2cb412a1db5dd24c833bda52b067160148ad83"/>
-    <w:p>
-      <w:pPr>
-        <w:pStyle w:val="Heading3"/>
-      </w:pPr>
-      <w:r>
-        <w:t xml:space="preserve">Part 4: Onboarding Training Guide (20 minutes)</w:t>
-      </w:r>
-    </w:p>
-    <w:p>
-      <w:pPr>
-        <w:pStyle w:val="FirstParagraph"/>
-      </w:pPr>
-      <w:r>
-        <w:rPr>
-          <w:b/>
-          <w:bCs/>
-        </w:rPr>
-        <w:t xml:space="preserve">Task:</w:t>
-      </w:r>
-      <w:r>
-        <w:t xml:space="preserve"> </w:t>
-      </w:r>
-      <w:r>
-        <w:t xml:space="preserve">Transform your job description into a structured 2-week onboarding training plan for the new HR Coordinator.</w:t>
-      </w:r>
-    </w:p>
-    <w:p>
-      <w:pPr>
-        <w:pStyle w:val="BodyText"/>
-      </w:pPr>
-      <w:r>
-        <w:rPr>
-          <w:b/>
-          <w:bCs/>
-        </w:rPr>
-        <w:t xml:space="preserve">Steps:</w:t>
-      </w:r>
-      <w:r>
-        <w:t xml:space="preserve"> </w:t>
-      </w:r>
-      <w:r>
-        <w:t xml:space="preserve">1. Prompt the AI to convert the job description into a phased training plan:</w:t>
-      </w:r>
-      <w:r>
-        <w:t xml:space="preserve"> </w:t>
-      </w:r>
-      <w:r>
-        <w:t xml:space="preserve">-</w:t>
-      </w:r>
-      <w:r>
-        <w:t xml:space="preserve"> </w:t>
-      </w:r>
-      <w:r>
-        <w:rPr>
-          <w:b/>
-          <w:bCs/>
-        </w:rPr>
-        <w:t xml:space="preserve">Day 1-2:</w:t>
-      </w:r>
-      <w:r>
-        <w:t xml:space="preserve"> </w:t>
-      </w:r>
-      <w:r>
-        <w:t xml:space="preserve">Orientation, systems access, and introductions (what does the new hire need on day one?)</w:t>
-      </w:r>
-      <w:r>
-        <w:t xml:space="preserve"> </w:t>
-      </w:r>
-      <w:r>
-        <w:t xml:space="preserve">-</w:t>
-      </w:r>
-      <w:r>
-        <w:t xml:space="preserve"> </w:t>
-      </w:r>
-      <w:r>
-        <w:rPr>
-          <w:b/>
-          <w:bCs/>
-        </w:rPr>
-        <w:t xml:space="preserve">Day 3-5:</w:t>
-      </w:r>
-      <w:r>
-        <w:t xml:space="preserve"> </w:t>
-      </w:r>
-      <w:r>
-        <w:t xml:space="preserve">Core process training (which recurring tasks need to be mastered first?)</w:t>
-      </w:r>
-      <w:r>
-        <w:t xml:space="preserve"> </w:t>
-      </w:r>
-      <w:r>
-        <w:t xml:space="preserve">-</w:t>
-      </w:r>
-      <w:r>
-        <w:t xml:space="preserve"> </w:t>
-      </w:r>
-      <w:r>
-        <w:rPr>
-          <w:b/>
-          <w:bCs/>
-        </w:rPr>
-        <w:t xml:space="preserve">Week 2:</w:t>
-      </w:r>
-      <w:r>
-        <w:t xml:space="preserve"> </w:t>
-      </w:r>
-      <w:r>
-        <w:t xml:space="preserve">Guided practice with increasing independence (shadowing key processes, handling real tasks with supervision)</w:t>
-      </w:r>
-      <w:r>
-        <w:t xml:space="preserve"> </w:t>
-      </w:r>
-      <w:r>
-        <w:t xml:space="preserve">2. For each phase, include:</w:t>
-      </w:r>
-      <w:r>
-        <w:t xml:space="preserve"> </w:t>
-      </w:r>
-      <w:r>
-        <w:t xml:space="preserve">- Specific learning objectives</w:t>
-      </w:r>
-      <w:r>
-        <w:t xml:space="preserve"> </w:t>
-      </w:r>
-      <w:r>
-        <w:t xml:space="preserve">- Training methods (job shadowing, e-learning, hands-on practice, mentoring)</w:t>
-      </w:r>
-      <w:r>
-        <w:t xml:space="preserve"> </w:t>
-      </w:r>
-      <w:r>
-        <w:t xml:space="preserve">- Key people the new hire should meet and learn from</w:t>
-      </w:r>
-      <w:r>
-        <w:t xml:space="preserve"> </w:t>
-      </w:r>
-      <w:r>
-        <w:t xml:space="preserve">- Success metrics (how do we know the training worked?)</w:t>
-      </w:r>
-      <w:r>
-        <w:t xml:space="preserve"> </w:t>
-      </w:r>
-      <w:r>
-        <w:t xml:space="preserve">3. Identify at least 3 things the AI-generated training plan got wrong or missed, and correct them</w:t>
-      </w:r>
-    </w:p>
-    <w:p>
-      <w:pPr>
-        <w:pStyle w:val="BodyText"/>
-      </w:pPr>
-      <w:r>
-        <w:rPr>
-          <w:b/>
-          <w:bCs/>
-        </w:rPr>
-        <w:t xml:space="preserve">Deliverable:</w:t>
-      </w:r>
-      <w:r>
-        <w:t xml:space="preserve"> </w:t>
-      </w:r>
-      <w:r>
-        <w:t xml:space="preserve">A 2-week onboarding training guide (1-2 pages).</w:t>
-      </w:r>
-    </w:p>
     <w:bookmarkEnd w:id="48"/>
-    <w:bookmarkEnd w:id="49"/>
-    <w:bookmarkStart w:id="50" w:name="discussion-questions"/>
+    <w:bookmarkStart w:id="49" w:name="discussion-questions"/>
     <w:p>
       <w:pPr>
         <w:pStyle w:val="Heading2"/>
@@ -4680,8 +4688,8 @@
         <w:t xml:space="preserve">If this is true, should organizations even invest in onboarding training, or should they focus entirely on giving new hires time to build relationships?</w:t>
       </w:r>
     </w:p>
-    <w:bookmarkEnd w:id="50"/>
-    <w:bookmarkStart w:id="51" w:name="grading-rubric"/>
+    <w:bookmarkEnd w:id="49"/>
+    <w:bookmarkStart w:id="50" w:name="grading-rubric"/>
     <w:p>
       <w:pPr>
         <w:pStyle w:val="Heading2"/>
@@ -4694,7 +4702,6 @@
       <w:tblPr>
         <w:tblW w:type="pct" w:w="5000"/>
         <w:tblStyle w:val="Table"/>
-        <w:tblLayout w:type="fixed"/>
         <w:tblLook w:firstRow="1" w:lastRow="0" w:firstColumn="0" w:lastColumn="0" w:noHBand="0" w:noVBand="0" w:val="0020"/>
         <w:tblBorders>
           <w:top w:val="single" w:sz="4" w:space="0" w:color="000000"/>
@@ -4704,20 +4711,23 @@
           <w:insideH w:val="single" w:sz="4" w:space="0" w:color="000000"/>
           <w:insideV w:val="single" w:sz="4" w:space="0" w:color="000000"/>
         </w:tblBorders>
+        <w:tblLayout w:type="fixed"/>
       </w:tblPr>
       <w:tblGrid>
-        <w:gridCol w:w="1075"/>
-        <w:gridCol w:w="1466"/>
-        <w:gridCol w:w="1173"/>
-        <w:gridCol w:w="2346"/>
-        <w:gridCol w:w="1857"/>
+        <w:gridCol w:w="1872"/>
+        <w:gridCol w:w="1872"/>
+        <w:gridCol w:w="1872"/>
+        <w:gridCol w:w="1872"/>
+        <w:gridCol w:w="1872"/>
       </w:tblGrid>
       <w:tr>
         <w:trPr>
           <w:tblHeader w:val="on"/>
         </w:trPr>
         <w:tc>
-          <w:tcPr/>
+          <w:tcPr>
+            <w:tcW w:type="dxa" w:w="1872"/>
+          </w:tcPr>
           <w:p>
             <w:pPr>
               <w:pStyle w:val="Compact"/>
@@ -4728,7 +4738,9 @@
           </w:p>
         </w:tc>
         <w:tc>
-          <w:tcPr/>
+          <w:tcPr>
+            <w:tcW w:type="dxa" w:w="1872"/>
+          </w:tcPr>
           <w:p>
             <w:pPr>
               <w:pStyle w:val="Compact"/>
@@ -4739,7 +4751,9 @@
           </w:p>
         </w:tc>
         <w:tc>
-          <w:tcPr/>
+          <w:tcPr>
+            <w:tcW w:type="dxa" w:w="1872"/>
+          </w:tcPr>
           <w:p>
             <w:pPr>
               <w:pStyle w:val="Compact"/>
@@ -4750,7 +4764,9 @@
           </w:p>
         </w:tc>
         <w:tc>
-          <w:tcPr/>
+          <w:tcPr>
+            <w:tcW w:type="dxa" w:w="1872"/>
+          </w:tcPr>
           <w:p>
             <w:pPr>
               <w:pStyle w:val="Compact"/>
@@ -4761,7 +4777,9 @@
           </w:p>
         </w:tc>
         <w:tc>
-          <w:tcPr/>
+          <w:tcPr>
+            <w:tcW w:type="dxa" w:w="1872"/>
+          </w:tcPr>
           <w:p>
             <w:pPr>
               <w:pStyle w:val="Compact"/>
@@ -4774,7 +4792,9 @@
       </w:tr>
       <w:tr>
         <w:tc>
-          <w:tcPr/>
+          <w:tcPr>
+            <w:tcW w:type="dxa" w:w="1872"/>
+          </w:tcPr>
           <w:p>
             <w:pPr>
               <w:pStyle w:val="Compact"/>
@@ -4789,7 +4809,9 @@
           </w:p>
         </w:tc>
         <w:tc>
-          <w:tcPr/>
+          <w:tcPr>
+            <w:tcW w:type="dxa" w:w="1872"/>
+          </w:tcPr>
           <w:p>
             <w:pPr>
               <w:pStyle w:val="Compact"/>
@@ -4800,7 +4822,9 @@
           </w:p>
         </w:tc>
         <w:tc>
-          <w:tcPr/>
+          <w:tcPr>
+            <w:tcW w:type="dxa" w:w="1872"/>
+          </w:tcPr>
           <w:p>
             <w:pPr>
               <w:pStyle w:val="Compact"/>
@@ -4811,7 +4835,9 @@
           </w:p>
         </w:tc>
         <w:tc>
-          <w:tcPr/>
+          <w:tcPr>
+            <w:tcW w:type="dxa" w:w="1872"/>
+          </w:tcPr>
           <w:p>
             <w:pPr>
               <w:pStyle w:val="Compact"/>
@@ -4822,7 +4848,9 @@
           </w:p>
         </w:tc>
         <w:tc>
-          <w:tcPr/>
+          <w:tcPr>
+            <w:tcW w:type="dxa" w:w="1872"/>
+          </w:tcPr>
           <w:p>
             <w:pPr>
               <w:pStyle w:val="Compact"/>
@@ -4835,7 +4863,9 @@
       </w:tr>
       <w:tr>
         <w:tc>
-          <w:tcPr/>
+          <w:tcPr>
+            <w:tcW w:type="dxa" w:w="1872"/>
+          </w:tcPr>
           <w:p>
             <w:pPr>
               <w:pStyle w:val="Compact"/>
@@ -4850,7 +4880,9 @@
           </w:p>
         </w:tc>
         <w:tc>
-          <w:tcPr/>
+          <w:tcPr>
+            <w:tcW w:type="dxa" w:w="1872"/>
+          </w:tcPr>
           <w:p>
             <w:pPr>
               <w:pStyle w:val="Compact"/>
@@ -4861,7 +4893,9 @@
           </w:p>
         </w:tc>
         <w:tc>
-          <w:tcPr/>
+          <w:tcPr>
+            <w:tcW w:type="dxa" w:w="1872"/>
+          </w:tcPr>
           <w:p>
             <w:pPr>
               <w:pStyle w:val="Compact"/>
@@ -4872,7 +4906,9 @@
           </w:p>
         </w:tc>
         <w:tc>
-          <w:tcPr/>
+          <w:tcPr>
+            <w:tcW w:type="dxa" w:w="1872"/>
+          </w:tcPr>
           <w:p>
             <w:pPr>
               <w:pStyle w:val="Compact"/>
@@ -4883,7 +4919,9 @@
           </w:p>
         </w:tc>
         <w:tc>
-          <w:tcPr/>
+          <w:tcPr>
+            <w:tcW w:type="dxa" w:w="1872"/>
+          </w:tcPr>
           <w:p>
             <w:pPr>
               <w:pStyle w:val="Compact"/>
@@ -4896,7 +4934,9 @@
       </w:tr>
       <w:tr>
         <w:tc>
-          <w:tcPr/>
+          <w:tcPr>
+            <w:tcW w:type="dxa" w:w="1872"/>
+          </w:tcPr>
           <w:p>
             <w:pPr>
               <w:pStyle w:val="Compact"/>
@@ -4911,7 +4951,9 @@
           </w:p>
         </w:tc>
         <w:tc>
-          <w:tcPr/>
+          <w:tcPr>
+            <w:tcW w:type="dxa" w:w="1872"/>
+          </w:tcPr>
           <w:p>
             <w:pPr>
               <w:pStyle w:val="Compact"/>
@@ -4922,7 +4964,9 @@
           </w:p>
         </w:tc>
         <w:tc>
-          <w:tcPr/>
+          <w:tcPr>
+            <w:tcW w:type="dxa" w:w="1872"/>
+          </w:tcPr>
           <w:p>
             <w:pPr>
               <w:pStyle w:val="Compact"/>
@@ -4933,7 +4977,9 @@
           </w:p>
         </w:tc>
         <w:tc>
-          <w:tcPr/>
+          <w:tcPr>
+            <w:tcW w:type="dxa" w:w="1872"/>
+          </w:tcPr>
           <w:p>
             <w:pPr>
               <w:pStyle w:val="Compact"/>
@@ -4944,7 +4990,9 @@
           </w:p>
         </w:tc>
         <w:tc>
-          <w:tcPr/>
+          <w:tcPr>
+            <w:tcW w:type="dxa" w:w="1872"/>
+          </w:tcPr>
           <w:p>
             <w:pPr>
               <w:pStyle w:val="Compact"/>
@@ -4957,7 +5005,9 @@
       </w:tr>
       <w:tr>
         <w:tc>
-          <w:tcPr/>
+          <w:tcPr>
+            <w:tcW w:type="dxa" w:w="1872"/>
+          </w:tcPr>
           <w:p>
             <w:pPr>
               <w:pStyle w:val="Compact"/>
@@ -4972,7 +5022,9 @@
           </w:p>
         </w:tc>
         <w:tc>
-          <w:tcPr/>
+          <w:tcPr>
+            <w:tcW w:type="dxa" w:w="1872"/>
+          </w:tcPr>
           <w:p>
             <w:pPr>
               <w:pStyle w:val="Compact"/>
@@ -4983,7 +5035,9 @@
           </w:p>
         </w:tc>
         <w:tc>
-          <w:tcPr/>
+          <w:tcPr>
+            <w:tcW w:type="dxa" w:w="1872"/>
+          </w:tcPr>
           <w:p>
             <w:pPr>
               <w:pStyle w:val="Compact"/>
@@ -4994,7 +5048,9 @@
           </w:p>
         </w:tc>
         <w:tc>
-          <w:tcPr/>
+          <w:tcPr>
+            <w:tcW w:type="dxa" w:w="1872"/>
+          </w:tcPr>
           <w:p>
             <w:pPr>
               <w:pStyle w:val="Compact"/>
@@ -5005,7 +5061,9 @@
           </w:p>
         </w:tc>
         <w:tc>
-          <w:tcPr/>
+          <w:tcPr>
+            <w:tcW w:type="dxa" w:w="1872"/>
+          </w:tcPr>
           <w:p>
             <w:pPr>
               <w:pStyle w:val="Compact"/>
@@ -5018,7 +5076,9 @@
       </w:tr>
       <w:tr>
         <w:tc>
-          <w:tcPr/>
+          <w:tcPr>
+            <w:tcW w:type="dxa" w:w="1872"/>
+          </w:tcPr>
           <w:p>
             <w:pPr>
               <w:pStyle w:val="Compact"/>
@@ -5033,7 +5093,9 @@
           </w:p>
         </w:tc>
         <w:tc>
-          <w:tcPr/>
+          <w:tcPr>
+            <w:tcW w:type="dxa" w:w="1872"/>
+          </w:tcPr>
           <w:p>
             <w:pPr>
               <w:pStyle w:val="Compact"/>
@@ -5044,7 +5106,9 @@
           </w:p>
         </w:tc>
         <w:tc>
-          <w:tcPr/>
+          <w:tcPr>
+            <w:tcW w:type="dxa" w:w="1872"/>
+          </w:tcPr>
           <w:p>
             <w:pPr>
               <w:pStyle w:val="Compact"/>
@@ -5055,7 +5119,9 @@
           </w:p>
         </w:tc>
         <w:tc>
-          <w:tcPr/>
+          <w:tcPr>
+            <w:tcW w:type="dxa" w:w="1872"/>
+          </w:tcPr>
           <w:p>
             <w:pPr>
               <w:pStyle w:val="Compact"/>
@@ -5066,7 +5132,9 @@
           </w:p>
         </w:tc>
         <w:tc>
-          <w:tcPr/>
+          <w:tcPr>
+            <w:tcW w:type="dxa" w:w="1872"/>
+          </w:tcPr>
           <w:p>
             <w:pPr>
               <w:pStyle w:val="Compact"/>
@@ -5079,7 +5147,9 @@
       </w:tr>
       <w:tr>
         <w:tc>
-          <w:tcPr/>
+          <w:tcPr>
+            <w:tcW w:type="dxa" w:w="1872"/>
+          </w:tcPr>
           <w:p>
             <w:pPr>
               <w:pStyle w:val="Compact"/>
@@ -5094,7 +5164,9 @@
           </w:p>
         </w:tc>
         <w:tc>
-          <w:tcPr/>
+          <w:tcPr>
+            <w:tcW w:type="dxa" w:w="1872"/>
+          </w:tcPr>
           <w:p>
             <w:pPr>
               <w:pStyle w:val="Compact"/>
@@ -5105,7 +5177,9 @@
           </w:p>
         </w:tc>
         <w:tc>
-          <w:tcPr/>
+          <w:tcPr>
+            <w:tcW w:type="dxa" w:w="1872"/>
+          </w:tcPr>
           <w:p>
             <w:pPr>
               <w:pStyle w:val="Compact"/>
@@ -5116,7 +5190,9 @@
           </w:p>
         </w:tc>
         <w:tc>
-          <w:tcPr/>
+          <w:tcPr>
+            <w:tcW w:type="dxa" w:w="1872"/>
+          </w:tcPr>
           <w:p>
             <w:pPr>
               <w:pStyle w:val="Compact"/>
@@ -5127,7 +5203,9 @@
           </w:p>
         </w:tc>
         <w:tc>
-          <w:tcPr/>
+          <w:tcPr>
+            <w:tcW w:type="dxa" w:w="1872"/>
+          </w:tcPr>
           <w:p>
             <w:pPr>
               <w:pStyle w:val="Compact"/>
@@ -5151,8 +5229,10 @@
         <w:t xml:space="preserve">Total: 60 points</w:t>
       </w:r>
     </w:p>
+    <w:bookmarkEnd w:id="50"/>
     <w:bookmarkEnd w:id="51"/>
     <w:bookmarkEnd w:id="52"/>
+    <w:bookmarkEnd w:id="53"/>
     <w:sectPr>
       <w:footnotePr>
         <w:numRestart w:val="eachSect"/>
@@ -5633,9 +5713,9 @@
   <w:docDefaults>
     <w:rPrDefault>
       <w:rPr>
-        <w:rFonts w:asciiTheme="minorHAnsi" w:cstheme="minorBidi" w:eastAsiaTheme="minorEastAsia" w:hAnsiTheme="minorHAnsi"/>
-        <w:sz w:val="24"/>
-        <w:szCs w:val="24"/>
+        <w:rFonts w:ascii="Calibri" w:asciiTheme="minorHAnsi" w:cstheme="minorBidi" w:eastAsia="Malgun Gothic" w:eastAsiaTheme="minorEastAsia" w:hAnsi="Calibri" w:hAnsiTheme="minorHAnsi"/>
+        <w:sz w:val="22"/>
+        <w:szCs w:val="22"/>
         <w:lang w:bidi="ar-SA" w:eastAsia="zh-CN" w:val="en-US"/>
       </w:rPr>
     </w:rPrDefault>
@@ -5649,6 +5729,11 @@
   <w:style w:default="1" w:styleId="Normal" w:type="paragraph">
     <w:name w:val="Normal"/>
     <w:qFormat/>
+    <w:rPr>
+      <w:rFonts w:ascii="Calibri" w:hAnsi="Calibri"/>
+      <w:color w:val="000000"/>
+      <w:sz w:val="22"/>
+    </w:rPr>
   </w:style>
   <w:style w:styleId="BodyText" w:type="paragraph">
     <w:name w:val="Body Text"/>
@@ -5658,12 +5743,20 @@
     <w:pPr>
       <w:spacing w:after="180" w:before="180"/>
     </w:pPr>
+    <w:rPr>
+      <w:rFonts w:ascii="Calibri" w:hAnsi="Calibri"/>
+      <w:color w:val="000000"/>
+      <w:sz w:val="22"/>
+    </w:rPr>
   </w:style>
   <w:style w:customStyle="1" w:styleId="FirstParagraph" w:type="paragraph">
     <w:name w:val="First Paragraph"/>
     <w:basedOn w:val="BodyText"/>
     <w:next w:val="BodyText"/>
     <w:qFormat/>
+    <w:rPr>
+      <w:rFonts w:ascii="Calibri" w:hAnsi="Calibri"/>
+    </w:rPr>
   </w:style>
   <w:style w:customStyle="1" w:styleId="Compact" w:type="paragraph">
     <w:name w:val="Compact"/>
@@ -5672,6 +5765,9 @@
     <w:pPr>
       <w:spacing w:after="36" w:before="36"/>
     </w:pPr>
+    <w:rPr>
+      <w:rFonts w:ascii="Calibri" w:hAnsi="Calibri"/>
+    </w:rPr>
   </w:style>
   <w:style w:styleId="Title" w:type="paragraph">
     <w:name w:val="Title"/>
@@ -5687,7 +5783,7 @@
       <w:jc w:val="center"/>
     </w:pPr>
     <w:rPr>
-      <w:rFonts w:asciiTheme="majorHAnsi" w:cstheme="majorBidi" w:eastAsiaTheme="majorEastAsia" w:hAnsiTheme="majorHAnsi"/>
+      <w:rFonts w:ascii="Calibri" w:asciiTheme="majorHAnsi" w:cstheme="majorBidi" w:eastAsiaTheme="majorEastAsia" w:hAnsi="Calibri" w:hAnsiTheme="majorHAnsi"/>
       <w:sz w:val="56"/>
       <w:szCs w:val="56"/>
     </w:rPr>
@@ -5699,7 +5795,7 @@
     <w:uiPriority w:val="10"/>
     <w:rsid w:val="00A10FD9"/>
     <w:rPr>
-      <w:rFonts w:asciiTheme="majorHAnsi" w:cstheme="majorBidi" w:eastAsiaTheme="majorEastAsia" w:hAnsiTheme="majorHAnsi"/>
+      <w:rFonts w:ascii="Calibri" w:asciiTheme="majorHAnsi" w:cstheme="majorBidi" w:eastAsiaTheme="majorEastAsia" w:hAnsi="Calibri" w:hAnsiTheme="majorHAnsi"/>
       <w:sz w:val="56"/>
       <w:szCs w:val="56"/>
     </w:rPr>
@@ -5718,7 +5814,7 @@
       </w:numPr>
     </w:pPr>
     <w:rPr>
-      <w:rFonts w:cstheme="majorBidi" w:eastAsiaTheme="majorEastAsia"/>
+      <w:rFonts w:ascii="Calibri" w:cstheme="majorBidi" w:eastAsiaTheme="majorEastAsia" w:hAnsi="Calibri"/>
       <w:spacing w:val="15"/>
       <w:sz w:val="28"/>
       <w:szCs w:val="28"/>
@@ -5731,7 +5827,7 @@
     <w:uiPriority w:val="11"/>
     <w:rsid w:val="00A10FD9"/>
     <w:rPr>
-      <w:rFonts w:cstheme="majorBidi" w:eastAsiaTheme="majorEastAsia"/>
+      <w:rFonts w:ascii="Calibri" w:cstheme="majorBidi" w:eastAsiaTheme="majorEastAsia" w:hAnsi="Calibri"/>
       <w:color w:themeColor="text1" w:themeTint="A6" w:val="595959"/>
       <w:spacing w:val="15"/>
       <w:sz w:val="28"/>
@@ -5748,6 +5844,7 @@
       <w:keepLines/>
     </w:pPr>
     <w:rPr>
+      <w:rFonts w:ascii="Calibri" w:hAnsi="Calibri"/>
       <w:sz w:val="24"/>
       <w:szCs w:val="24"/>
     </w:rPr>
@@ -5762,6 +5859,7 @@
       <w:keepLines/>
     </w:pPr>
     <w:rPr>
+      <w:rFonts w:ascii="Calibri" w:hAnsi="Calibri"/>
       <w:sz w:val="24"/>
       <w:szCs w:val="24"/>
     </w:rPr>
@@ -5778,6 +5876,7 @@
       <w:jc w:val="center"/>
     </w:pPr>
     <w:rPr>
+      <w:rFonts w:ascii="Calibri" w:hAnsi="Calibri"/>
       <w:b/>
       <w:sz w:val="20"/>
       <w:szCs w:val="20"/>
@@ -5794,6 +5893,7 @@
       <w:spacing w:after="300" w:before="100"/>
     </w:pPr>
     <w:rPr>
+      <w:rFonts w:ascii="Calibri" w:hAnsi="Calibri"/>
       <w:sz w:val="20"/>
       <w:szCs w:val="20"/>
     </w:rPr>
@@ -5804,7 +5904,9 @@
     <w:next w:val="Bibliography"/>
     <w:qFormat/>
     <w:pPr/>
-    <w:rPr/>
+    <w:rPr>
+      <w:rFonts w:ascii="Calibri" w:hAnsi="Calibri"/>
+    </w:rPr>
   </w:style>
   <w:style w:styleId="Heading1" w:type="paragraph">
     <w:name w:val="heading 1"/>
@@ -5821,7 +5923,7 @@
       <w:outlineLvl w:val="0"/>
     </w:pPr>
     <w:rPr>
-      <w:rFonts w:asciiTheme="majorHAnsi" w:cstheme="majorBidi" w:eastAsiaTheme="majorEastAsia" w:hAnsiTheme="majorHAnsi"/>
+      <w:rFonts w:ascii="Calibri" w:asciiTheme="majorHAnsi" w:cstheme="majorBidi" w:eastAsiaTheme="majorEastAsia" w:hAnsi="Calibri" w:hAnsiTheme="majorHAnsi"/>
       <w:color w:themeColor="accent1" w:themeShade="BF" w:val="0F4761"/>
       <w:sz w:val="40"/>
       <w:szCs w:val="40"/>
@@ -5844,7 +5946,7 @@
       <w:outlineLvl w:val="1"/>
     </w:pPr>
     <w:rPr>
-      <w:rFonts w:asciiTheme="majorHAnsi" w:cstheme="majorBidi" w:eastAsiaTheme="majorEastAsia" w:hAnsiTheme="majorHAnsi"/>
+      <w:rFonts w:ascii="Calibri" w:asciiTheme="majorHAnsi" w:cstheme="majorBidi" w:eastAsiaTheme="majorEastAsia" w:hAnsi="Calibri" w:hAnsiTheme="majorHAnsi"/>
       <w:color w:themeColor="accent1" w:themeShade="BF" w:val="0F4761"/>
       <w:sz w:val="32"/>
       <w:szCs w:val="32"/>
@@ -5867,7 +5969,7 @@
       <w:outlineLvl w:val="2"/>
     </w:pPr>
     <w:rPr>
-      <w:rFonts w:cstheme="majorBidi" w:eastAsiaTheme="majorEastAsia"/>
+      <w:rFonts w:ascii="Calibri" w:cstheme="majorBidi" w:eastAsiaTheme="majorEastAsia" w:hAnsi="Calibri"/>
       <w:color w:themeColor="accent1" w:themeShade="BF" w:val="0F4761"/>
       <w:sz w:val="28"/>
       <w:szCs w:val="28"/>
@@ -5890,7 +5992,7 @@
       <w:outlineLvl w:val="3"/>
     </w:pPr>
     <w:rPr>
-      <w:rFonts w:cstheme="majorBidi" w:eastAsiaTheme="majorEastAsia"/>
+      <w:rFonts w:ascii="Calibri" w:cstheme="majorBidi" w:eastAsiaTheme="majorEastAsia" w:hAnsi="Calibri"/>
       <w:i/>
       <w:iCs/>
       <w:color w:themeColor="accent1" w:themeShade="BF" w:val="0F4761"/>
@@ -5913,7 +6015,7 @@
       <w:outlineLvl w:val="4"/>
     </w:pPr>
     <w:rPr>
-      <w:rFonts w:cstheme="majorBidi" w:eastAsiaTheme="majorEastAsia"/>
+      <w:rFonts w:ascii="Calibri" w:cstheme="majorBidi" w:eastAsiaTheme="majorEastAsia" w:hAnsi="Calibri"/>
       <w:color w:themeColor="accent1" w:themeShade="BF" w:val="0F4761"/>
     </w:rPr>
   </w:style>
@@ -5934,7 +6036,7 @@
       <w:outlineLvl w:val="5"/>
     </w:pPr>
     <w:rPr>
-      <w:rFonts w:cstheme="majorBidi" w:eastAsiaTheme="majorEastAsia"/>
+      <w:rFonts w:ascii="Calibri" w:cstheme="majorBidi" w:eastAsiaTheme="majorEastAsia" w:hAnsi="Calibri"/>
       <w:i/>
       <w:iCs/>
       <w:color w:themeColor="text1" w:themeTint="A6" w:val="595959"/>
@@ -5957,7 +6059,7 @@
       <w:outlineLvl w:val="6"/>
     </w:pPr>
     <w:rPr>
-      <w:rFonts w:cstheme="majorBidi" w:eastAsiaTheme="majorEastAsia"/>
+      <w:rFonts w:ascii="Calibri" w:cstheme="majorBidi" w:eastAsiaTheme="majorEastAsia" w:hAnsi="Calibri"/>
       <w:color w:themeColor="text1" w:themeTint="A6" w:val="595959"/>
     </w:rPr>
   </w:style>
@@ -5978,7 +6080,7 @@
       <w:outlineLvl w:val="7"/>
     </w:pPr>
     <w:rPr>
-      <w:rFonts w:cstheme="majorBidi" w:eastAsiaTheme="majorEastAsia"/>
+      <w:rFonts w:ascii="Calibri" w:cstheme="majorBidi" w:eastAsiaTheme="majorEastAsia" w:hAnsi="Calibri"/>
       <w:i/>
       <w:iCs/>
       <w:color w:themeColor="text1" w:themeTint="D8" w:val="272727"/>
@@ -6001,7 +6103,7 @@
       <w:outlineLvl w:val="8"/>
     </w:pPr>
     <w:rPr>
-      <w:rFonts w:cstheme="majorBidi" w:eastAsiaTheme="majorEastAsia"/>
+      <w:rFonts w:ascii="Calibri" w:cstheme="majorBidi" w:eastAsiaTheme="majorEastAsia" w:hAnsi="Calibri"/>
       <w:color w:themeColor="text1" w:themeTint="D8" w:val="272727"/>
     </w:rPr>
   </w:style>
@@ -6012,7 +6114,7 @@
     <w:uiPriority w:val="9"/>
     <w:rsid w:val="00A10FD9"/>
     <w:rPr>
-      <w:rFonts w:asciiTheme="majorHAnsi" w:cstheme="majorBidi" w:eastAsiaTheme="majorEastAsia" w:hAnsiTheme="majorHAnsi"/>
+      <w:rFonts w:ascii="Calibri" w:asciiTheme="majorHAnsi" w:cstheme="majorBidi" w:eastAsiaTheme="majorEastAsia" w:hAnsi="Calibri" w:hAnsiTheme="majorHAnsi"/>
       <w:color w:themeColor="accent1" w:themeShade="BF" w:val="0F4761"/>
       <w:sz w:val="40"/>
       <w:szCs w:val="40"/>
@@ -6026,7 +6128,7 @@
     <w:semiHidden/>
     <w:rsid w:val="00A10FD9"/>
     <w:rPr>
-      <w:rFonts w:asciiTheme="majorHAnsi" w:cstheme="majorBidi" w:eastAsiaTheme="majorEastAsia" w:hAnsiTheme="majorHAnsi"/>
+      <w:rFonts w:ascii="Calibri" w:asciiTheme="majorHAnsi" w:cstheme="majorBidi" w:eastAsiaTheme="majorEastAsia" w:hAnsi="Calibri" w:hAnsiTheme="majorHAnsi"/>
       <w:color w:themeColor="accent1" w:themeShade="BF" w:val="0F4761"/>
       <w:sz w:val="32"/>
       <w:szCs w:val="32"/>
@@ -6040,7 +6142,7 @@
     <w:semiHidden/>
     <w:rsid w:val="00A10FD9"/>
     <w:rPr>
-      <w:rFonts w:cstheme="majorBidi" w:eastAsiaTheme="majorEastAsia"/>
+      <w:rFonts w:ascii="Calibri" w:cstheme="majorBidi" w:eastAsiaTheme="majorEastAsia" w:hAnsi="Calibri"/>
       <w:color w:themeColor="accent1" w:themeShade="BF" w:val="0F4761"/>
       <w:sz w:val="28"/>
       <w:szCs w:val="28"/>
@@ -6054,7 +6156,7 @@
     <w:semiHidden/>
     <w:rsid w:val="00A10FD9"/>
     <w:rPr>
-      <w:rFonts w:cstheme="majorBidi" w:eastAsiaTheme="majorEastAsia"/>
+      <w:rFonts w:ascii="Calibri" w:cstheme="majorBidi" w:eastAsiaTheme="majorEastAsia" w:hAnsi="Calibri"/>
       <w:i/>
       <w:iCs/>
       <w:color w:themeColor="accent1" w:themeShade="BF" w:val="0F4761"/>
@@ -6068,7 +6170,7 @@
     <w:semiHidden/>
     <w:rsid w:val="00A10FD9"/>
     <w:rPr>
-      <w:rFonts w:cstheme="majorBidi" w:eastAsiaTheme="majorEastAsia"/>
+      <w:rFonts w:ascii="Calibri" w:cstheme="majorBidi" w:eastAsiaTheme="majorEastAsia" w:hAnsi="Calibri"/>
       <w:color w:themeColor="accent1" w:themeShade="BF" w:val="0F4761"/>
     </w:rPr>
   </w:style>
@@ -6080,7 +6182,7 @@
     <w:semiHidden/>
     <w:rsid w:val="00A10FD9"/>
     <w:rPr>
-      <w:rFonts w:cstheme="majorBidi" w:eastAsiaTheme="majorEastAsia"/>
+      <w:rFonts w:ascii="Calibri" w:cstheme="majorBidi" w:eastAsiaTheme="majorEastAsia" w:hAnsi="Calibri"/>
       <w:i/>
       <w:iCs/>
       <w:color w:themeColor="text1" w:themeTint="A6" w:val="595959"/>
@@ -6094,7 +6196,7 @@
     <w:semiHidden/>
     <w:rsid w:val="00A10FD9"/>
     <w:rPr>
-      <w:rFonts w:cstheme="majorBidi" w:eastAsiaTheme="majorEastAsia"/>
+      <w:rFonts w:ascii="Calibri" w:cstheme="majorBidi" w:eastAsiaTheme="majorEastAsia" w:hAnsi="Calibri"/>
       <w:color w:themeColor="text1" w:themeTint="A6" w:val="595959"/>
     </w:rPr>
   </w:style>
@@ -6106,7 +6208,7 @@
     <w:semiHidden/>
     <w:rsid w:val="00A10FD9"/>
     <w:rPr>
-      <w:rFonts w:cstheme="majorBidi" w:eastAsiaTheme="majorEastAsia"/>
+      <w:rFonts w:ascii="Calibri" w:cstheme="majorBidi" w:eastAsiaTheme="majorEastAsia" w:hAnsi="Calibri"/>
       <w:i/>
       <w:iCs/>
       <w:color w:themeColor="text1" w:themeTint="D8" w:val="272727"/>
@@ -6120,7 +6222,7 @@
     <w:semiHidden/>
     <w:rsid w:val="00A10FD9"/>
     <w:rPr>
-      <w:rFonts w:cstheme="majorBidi" w:eastAsiaTheme="majorEastAsia"/>
+      <w:rFonts w:ascii="Calibri" w:cstheme="majorBidi" w:eastAsiaTheme="majorEastAsia" w:hAnsi="Calibri"/>
       <w:color w:themeColor="text1" w:themeTint="D8" w:val="272727"/>
     </w:rPr>
   </w:style>
@@ -6135,6 +6237,9 @@
       <w:spacing w:after="100" w:before="100"/>
       <w:ind w:firstLine="0" w:left="480" w:right="480"/>
     </w:pPr>
+    <w:rPr>
+      <w:rFonts w:ascii="Calibri" w:hAnsi="Calibri"/>
+    </w:rPr>
   </w:style>
   <w:style w:styleId="FootnoteText" w:type="paragraph">
     <w:name w:val="Footnote Text"/>
@@ -6143,6 +6248,9 @@
     <w:uiPriority w:val="9"/>
     <w:unhideWhenUsed/>
     <w:qFormat/>
+    <w:rPr>
+      <w:rFonts w:ascii="Calibri" w:hAnsi="Calibri"/>
+    </w:rPr>
   </w:style>
   <w:style w:styleId="FootnoteBlockText" w:type="paragraph">
     <w:name w:val="Footnote Block Text"/>
@@ -6155,11 +6263,17 @@
       <w:spacing w:after="100" w:before="100"/>
       <w:ind w:firstLine="0" w:left="480" w:right="480"/>
     </w:pPr>
+    <w:rPr>
+      <w:rFonts w:ascii="Calibri" w:hAnsi="Calibri"/>
+    </w:rPr>
   </w:style>
   <w:style w:default="1" w:styleId="DefaultParagraphFont" w:type="character">
     <w:name w:val="Default Paragraph Font"/>
     <w:semiHidden/>
     <w:unhideWhenUsed/>
+    <w:rPr>
+      <w:rFonts w:ascii="Calibri" w:hAnsi="Calibri"/>
+    </w:rPr>
   </w:style>
   <w:style w:default="1" w:styleId="Table" w:type="table">
     <w:name w:val="Table"/>
@@ -6167,6 +6281,9 @@
     <w:semiHidden/>
     <w:unhideWhenUsed/>
     <w:qFormat/>
+    <w:rPr>
+      <w:rFonts w:ascii="Calibri" w:hAnsi="Calibri"/>
+    </w:rPr>
     <w:tblPr>
       <w:tblInd w:type="dxa" w:w="0"/>
       <w:tblCellMar>
@@ -6195,12 +6312,16 @@
       <w:spacing w:after="0"/>
     </w:pPr>
     <w:rPr>
+      <w:rFonts w:ascii="Calibri" w:hAnsi="Calibri"/>
       <w:b/>
     </w:rPr>
   </w:style>
   <w:style w:customStyle="1" w:styleId="Definition" w:type="paragraph">
     <w:name w:val="Definition"/>
     <w:basedOn w:val="Normal"/>
+    <w:rPr>
+      <w:rFonts w:ascii="Calibri" w:hAnsi="Calibri"/>
+    </w:rPr>
   </w:style>
   <w:style w:styleId="Caption" w:type="paragraph">
     <w:name w:val="Caption"/>
@@ -6210,6 +6331,7 @@
       <w:spacing w:after="120" w:before="0"/>
     </w:pPr>
     <w:rPr>
+      <w:rFonts w:ascii="Calibri" w:hAnsi="Calibri"/>
       <w:i/>
     </w:rPr>
   </w:style>
@@ -6219,14 +6341,23 @@
     <w:pPr>
       <w:keepNext/>
     </w:pPr>
+    <w:rPr>
+      <w:rFonts w:ascii="Calibri" w:hAnsi="Calibri"/>
+    </w:rPr>
   </w:style>
   <w:style w:customStyle="1" w:styleId="ImageCaption" w:type="paragraph">
     <w:name w:val="Image Caption"/>
     <w:basedOn w:val="Caption"/>
+    <w:rPr>
+      <w:rFonts w:ascii="Calibri" w:hAnsi="Calibri"/>
+    </w:rPr>
   </w:style>
   <w:style w:customStyle="1" w:styleId="Figure" w:type="paragraph">
     <w:name w:val="Figure"/>
     <w:basedOn w:val="Normal"/>
+    <w:rPr>
+      <w:rFonts w:ascii="Calibri" w:hAnsi="Calibri"/>
+    </w:rPr>
   </w:style>
   <w:style w:customStyle="1" w:styleId="CaptionedFigure" w:type="paragraph">
     <w:name w:val="Captioned Figure"/>
@@ -6234,28 +6365,38 @@
     <w:pPr>
       <w:keepNext/>
     </w:pPr>
+    <w:rPr>
+      <w:rFonts w:ascii="Calibri" w:hAnsi="Calibri"/>
+    </w:rPr>
   </w:style>
   <w:style w:customStyle="1" w:styleId="BodyTextChar" w:type="character">
     <w:name w:val="Body Text Char"/>
     <w:basedOn w:val="DefaultParagraphFont"/>
     <w:link w:val="BodyText"/>
+    <w:rPr>
+      <w:rFonts w:ascii="Calibri" w:hAnsi="Calibri"/>
+    </w:rPr>
   </w:style>
   <w:style w:customStyle="1" w:styleId="VerbatimChar" w:type="character">
     <w:name w:val="Verbatim Char"/>
     <w:basedOn w:val="BodyTextChar"/>
     <w:rPr>
-      <w:rFonts w:ascii="Consolas" w:hAnsi="Consolas"/>
+      <w:rFonts w:ascii="Calibri" w:hAnsi="Calibri"/>
       <w:sz w:val="22"/>
     </w:rPr>
   </w:style>
   <w:style w:customStyle="1" w:styleId="SectionNumber" w:type="character">
     <w:name w:val="Section Number"/>
     <w:basedOn w:val="BodyTextChar"/>
+    <w:rPr>
+      <w:rFonts w:ascii="Calibri" w:hAnsi="Calibri"/>
+    </w:rPr>
   </w:style>
   <w:style w:styleId="FootnoteReference" w:type="character">
     <w:name w:val="Footnote Reference"/>
     <w:basedOn w:val="BodyTextChar"/>
     <w:rPr>
+      <w:rFonts w:ascii="Calibri" w:hAnsi="Calibri"/>
       <w:vertAlign w:val="superscript"/>
     </w:rPr>
   </w:style>
@@ -6263,6 +6404,7 @@
     <w:name w:val="Hyperlink"/>
     <w:basedOn w:val="BodyTextChar"/>
     <w:rPr>
+      <w:rFonts w:ascii="Calibri" w:hAnsi="Calibri"/>
       <w:color w:themeColor="accent1" w:val="4F81BD"/>
     </w:rPr>
   </w:style>
@@ -6278,7 +6420,7 @@
       <w:outlineLvl w:val="9"/>
     </w:pPr>
     <w:rPr>
-      <w:rFonts w:asciiTheme="majorHAnsi" w:cstheme="majorBidi" w:eastAsiaTheme="majorEastAsia" w:hAnsiTheme="majorHAnsi"/>
+      <w:rFonts w:ascii="Calibri" w:asciiTheme="majorHAnsi" w:cstheme="majorBidi" w:eastAsiaTheme="majorEastAsia" w:hAnsi="Calibri" w:hAnsiTheme="majorHAnsi"/>
       <w:b w:val="0"/>
       <w:bCs w:val="0"/>
       <w:color w:themeColor="accent1" w:themeShade="BF" w:val="365F91"/>

</xml_diff>